<commit_message>
adding net8 nad 9. WPF proj multitarget. Pastel Updated
</commit_message>
<xml_diff>
--- a/Src/DetailedSamples/Samples/Pdf/Resources/DocumentToConvertWithUninstalledFont.docx
+++ b/Src/DetailedSamples/Samples/Pdf/Resources/DocumentToConvertWithUninstalledFont.docx
@@ -1,11 +1,11 @@
 
 <file path=word/document.xml><?xml version="1.0" encoding="utf-8"?>
-<w:document xmlns:wpc="http://schemas.microsoft.com/office/word/2010/wordprocessingCanvas" xmlns:cx="http://schemas.microsoft.com/office/drawing/2014/chartex" xmlns:cx1="http://schemas.microsoft.com/office/drawing/2015/9/8/chartex" xmlns:cx2="http://schemas.microsoft.com/office/drawing/2015/10/21/chartex" xmlns:cx3="http://schemas.microsoft.com/office/drawing/2016/5/9/chartex" xmlns:cx4="http://schemas.microsoft.com/office/drawing/2016/5/10/chartex" xmlns:cx5="http://schemas.microsoft.com/office/drawing/2016/5/11/chartex" xmlns:cx6="http://schemas.microsoft.com/office/drawing/2016/5/12/chartex" xmlns:cx7="http://schemas.microsoft.com/office/drawing/2016/5/13/chartex" xmlns:cx8="http://schemas.microsoft.com/office/drawing/2016/5/14/chartex" xmlns:mc="http://schemas.openxmlformats.org/markup-compatibility/2006" xmlns:aink="http://schemas.microsoft.com/office/drawing/2016/ink" xmlns:am3d="http://schemas.microsoft.com/office/drawing/2017/model3d" xmlns:o="urn:schemas-microsoft-com:office:office" xmlns:r="http://schemas.openxmlformats.org/officeDocument/2006/relationships" xmlns:m="http://schemas.openxmlformats.org/officeDocument/2006/math" xmlns:v="urn:schemas-microsoft-com:vml" xmlns:wp14="http://schemas.microsoft.com/office/word/2010/wordprocessingDrawing" xmlns:wp="http://schemas.openxmlformats.org/drawingml/2006/wordprocessingDrawing" xmlns:w10="urn:schemas-microsoft-com:office:word" xmlns:w="http://schemas.openxmlformats.org/wordprocessingml/2006/main" xmlns:w14="http://schemas.microsoft.com/office/word/2010/wordml" xmlns:w15="http://schemas.microsoft.com/office/word/2012/wordml" xmlns:w16cex="http://schemas.microsoft.com/office/word/2018/wordml/cex" xmlns:w16cid="http://schemas.microsoft.com/office/word/2016/wordml/cid" xmlns:w16="http://schemas.microsoft.com/office/word/2018/wordml" xmlns:w16se="http://schemas.microsoft.com/office/word/2015/wordml/symex" xmlns:wpg="http://schemas.microsoft.com/office/word/2010/wordprocessingGroup" xmlns:wpi="http://schemas.microsoft.com/office/word/2010/wordprocessingInk" xmlns:wne="http://schemas.microsoft.com/office/word/2006/wordml" xmlns:wps="http://schemas.microsoft.com/office/word/2010/wordprocessingShape" mc:Ignorable="w14 w15 w16se w16cid w16 w16cex wp14">
+<w:document xmlns:wpc="http://schemas.microsoft.com/office/word/2010/wordprocessingCanvas" xmlns:cx="http://schemas.microsoft.com/office/drawing/2014/chartex" xmlns:mc="http://schemas.openxmlformats.org/markup-compatibility/2006" xmlns:o="urn:schemas-microsoft-com:office:office" xmlns:r="http://schemas.openxmlformats.org/officeDocument/2006/relationships" xmlns:m="http://schemas.openxmlformats.org/officeDocument/2006/math" xmlns:v="urn:schemas-microsoft-com:vml" xmlns:wp14="http://schemas.microsoft.com/office/word/2010/wordprocessingDrawing" xmlns:wp="http://schemas.openxmlformats.org/drawingml/2006/wordprocessingDrawing" xmlns:w10="urn:schemas-microsoft-com:office:word" xmlns:w="http://schemas.openxmlformats.org/wordprocessingml/2006/main" xmlns:w14="http://schemas.microsoft.com/office/word/2010/wordml" xmlns:w15="http://schemas.microsoft.com/office/word/2012/wordml" xmlns:w16se="http://schemas.microsoft.com/office/word/2015/wordml/symex" xmlns:wpg="http://schemas.microsoft.com/office/word/2010/wordprocessingGroup" xmlns:wpi="http://schemas.microsoft.com/office/word/2010/wordprocessingInk" xmlns:wne="http://schemas.microsoft.com/office/word/2006/wordml" xmlns:wps="http://schemas.microsoft.com/office/word/2010/wordprocessingShape" mc:Ignorable="w14 w15 w16se wp14">
   <w:body>
     <w:p>
       <w:pPr>
         <w:rPr>
-          <w:rFonts w:ascii="The Bugatten" w:hAnsi="The Bugatten"/>
+          <w:rFonts w:cstheme="minorHAnsi"/>
           <w:sz w:val="44"/>
           <w:szCs w:val="44"/>
           <w:lang w:val="en-CA"/>
@@ -13,16 +13,27 @@
       </w:pPr>
       <w:r>
         <w:rPr>
-          <w:rFonts w:ascii="The Bugatten" w:hAnsi="The Bugatten"/>
+          <w:rFonts w:cstheme="minorHAnsi"/>
           <w:sz w:val="44"/>
           <w:szCs w:val="44"/>
           <w:lang w:val="en-CA"/>
         </w:rPr>
-        <w:t>Hello everyone!</w:t>
+        <w:t>Hello everyo</w:t>
+      </w:r>
+      <w:bookmarkStart w:id="0" w:name="_GoBack"/>
+      <w:bookmarkEnd w:id="0"/>
+      <w:r>
+        <w:rPr>
+          <w:rFonts w:cstheme="minorHAnsi"/>
+          <w:sz w:val="44"/>
+          <w:szCs w:val="44"/>
+          <w:lang w:val="en-CA"/>
+        </w:rPr>
+        <w:t>ne!</w:t>
       </w:r>
       <w:r>
         <w:rPr>
-          <w:rFonts w:ascii="The Bugatten" w:hAnsi="The Bugatten"/>
+          <w:rFonts w:cstheme="minorHAnsi"/>
           <w:sz w:val="44"/>
           <w:szCs w:val="44"/>
           <w:lang w:val="en-CA"/>
@@ -33,14 +44,14 @@
     <w:p>
       <w:pPr>
         <w:rPr>
-          <w:rFonts w:ascii="The Bugatten" w:hAnsi="The Bugatten"/>
+          <w:rFonts w:cstheme="minorHAnsi"/>
           <w:sz w:val="44"/>
           <w:szCs w:val="44"/>
         </w:rPr>
       </w:pPr>
       <w:r>
         <w:rPr>
-          <w:rFonts w:ascii="The Bugatten" w:hAnsi="The Bugatten"/>
+          <w:rFonts w:cstheme="minorHAnsi"/>
           <w:sz w:val="44"/>
           <w:szCs w:val="44"/>
           <w:lang w:val="en-CA"/>
@@ -49,19 +60,11 @@
       </w:r>
       <w:r>
         <w:rPr>
-          <w:rFonts w:ascii="The Bugatten" w:hAnsi="The Bugatten"/>
+          <w:rFonts w:cstheme="minorHAnsi"/>
           <w:sz w:val="44"/>
           <w:szCs w:val="44"/>
         </w:rPr>
-        <w:t>’m using an u</w:t>
-      </w:r>
-      <w:r>
-        <w:rPr>
-          <w:rFonts w:ascii="The Bugatten" w:hAnsi="The Bugatten"/>
-          <w:sz w:val="44"/>
-          <w:szCs w:val="44"/>
-        </w:rPr>
-        <w:t>ninstalled font named “The Bugatten”. Converting to PDF will use this new font.</w:t>
+        <w:t>’m using an uninstalled font named “The Bugatten”. Converting to PDF will use this new font.</w:t>
       </w:r>
     </w:p>
     <w:sectPr>
@@ -75,7 +78,7 @@
 </file>
 
 <file path=word/styles.xml><?xml version="1.0" encoding="utf-8"?>
-<w:styles xmlns:mc="http://schemas.openxmlformats.org/markup-compatibility/2006" xmlns:r="http://schemas.openxmlformats.org/officeDocument/2006/relationships" xmlns:w="http://schemas.openxmlformats.org/wordprocessingml/2006/main" xmlns:w14="http://schemas.microsoft.com/office/word/2010/wordml" xmlns:w15="http://schemas.microsoft.com/office/word/2012/wordml" xmlns:w16cex="http://schemas.microsoft.com/office/word/2018/wordml/cex" xmlns:w16cid="http://schemas.microsoft.com/office/word/2016/wordml/cid" xmlns:w16="http://schemas.microsoft.com/office/word/2018/wordml" xmlns:w16se="http://schemas.microsoft.com/office/word/2015/wordml/symex" mc:Ignorable="w14 w15 w16se w16cid w16 w16cex">
+<w:styles xmlns:mc="http://schemas.openxmlformats.org/markup-compatibility/2006" xmlns:r="http://schemas.openxmlformats.org/officeDocument/2006/relationships" xmlns:w="http://schemas.openxmlformats.org/wordprocessingml/2006/main" xmlns:w14="http://schemas.microsoft.com/office/word/2010/wordml" xmlns:w15="http://schemas.microsoft.com/office/word/2012/wordml" xmlns:w16se="http://schemas.microsoft.com/office/word/2015/wordml/symex" mc:Ignorable="w14 w15 w16se">
   <w:docDefaults>
     <w:rPrDefault>
       <w:rPr>
@@ -91,7 +94,7 @@
       </w:pPr>
     </w:pPrDefault>
   </w:docDefaults>
-  <w:latentStyles w:defLockedState="0" w:defUIPriority="99" w:defSemiHidden="0" w:defUnhideWhenUsed="0" w:defQFormat="0" w:count="376">
+  <w:latentStyles w:defLockedState="0" w:defUIPriority="99" w:defSemiHidden="0" w:defUnhideWhenUsed="0" w:defQFormat="0" w:count="371">
     <w:lsdException w:name="Normal" w:uiPriority="0" w:qFormat="1"/>
     <w:lsdException w:name="heading 1" w:uiPriority="9" w:qFormat="1"/>
     <w:lsdException w:name="heading 2" w:semiHidden="1" w:uiPriority="9" w:unhideWhenUsed="1" w:qFormat="1"/>
@@ -463,23 +466,18 @@
     <w:lsdException w:name="List Table 5 Dark Accent 6" w:uiPriority="50"/>
     <w:lsdException w:name="List Table 6 Colorful Accent 6" w:uiPriority="51"/>
     <w:lsdException w:name="List Table 7 Colorful Accent 6" w:uiPriority="52"/>
-    <w:lsdException w:name="Mention" w:semiHidden="1" w:unhideWhenUsed="1"/>
-    <w:lsdException w:name="Smart Hyperlink" w:semiHidden="1" w:unhideWhenUsed="1"/>
-    <w:lsdException w:name="Hashtag" w:semiHidden="1" w:unhideWhenUsed="1"/>
-    <w:lsdException w:name="Unresolved Mention" w:semiHidden="1" w:unhideWhenUsed="1"/>
-    <w:lsdException w:name="Smart Link" w:semiHidden="1" w:unhideWhenUsed="1"/>
   </w:latentStyles>
   <w:style w:type="paragraph" w:default="1" w:styleId="Normal">
     <w:name w:val="Normal"/>
     <w:qFormat/>
   </w:style>
-  <w:style w:type="character" w:default="1" w:styleId="DefaultParagraphFont">
+  <w:style w:type="character" w:default="1" w:styleId="Fuentedeprrafopredeter">
     <w:name w:val="Default Paragraph Font"/>
     <w:uiPriority w:val="1"/>
     <w:semiHidden/>
     <w:unhideWhenUsed/>
   </w:style>
-  <w:style w:type="table" w:default="1" w:styleId="TableNormal">
+  <w:style w:type="table" w:default="1" w:styleId="Tablanormal">
     <w:name w:val="Normal Table"/>
     <w:uiPriority w:val="99"/>
     <w:semiHidden/>
@@ -494,7 +492,7 @@
       </w:tblCellMar>
     </w:tblPr>
   </w:style>
-  <w:style w:type="numbering" w:default="1" w:styleId="NoList">
+  <w:style w:type="numbering" w:default="1" w:styleId="Sinlista">
     <w:name w:val="No List"/>
     <w:uiPriority w:val="99"/>
     <w:semiHidden/>

</xml_diff>